<commit_message>
Update kiosk test record and estimated contribution hours
</commit_message>
<xml_diff>
--- a/Docs/Asraful/Asraful_Kiosk_Journeys_and_Test_Record_Corrected.docx
+++ b/Docs/Asraful/Asraful_Kiosk_Journeys_and_Test_Record_Corrected.docx
@@ -1986,7 +1986,7 @@
         <w:pStyle w:val="Heading2"/>
       </w:pPr>
       <w:r>
-        <w:t>Checks still requiring recorded results</w:t>
+        <w:t>Checks outstanding on 14 October 2026</w:t>
       </w:r>
     </w:p>
     <w:p>
@@ -1996,7 +1996,1052 @@
     </w:p>
     <w:p>
       <w:r>
-        <w:t>Add the tester, date, actual outcome and screenshot or issue link when each check is performed. Do not mark these checks passed solely because the code exists.</w:t>
+        <w:t>The update on the following pages records subsequent local testing on 15 October. Checks not covered by that update remain unverified.</w:t>
+      </w:r>
+    </w:p>
+    <w:p>
+      <w:r>
+        <w:br w:type="page"/>
+      </w:r>
+    </w:p>
+    <w:p>
+      <w:pPr>
+        <w:pStyle w:val="Title"/>
+      </w:pPr>
+      <w:r>
+        <w:t>Integrated testing update</w:t>
+      </w:r>
+    </w:p>
+    <w:p>
+      <w:r>
+        <w:t>Asraful Hasan Asif | 15 October 2026 | Local Windows application</w:t>
+      </w:r>
+    </w:p>
+    <w:p>
+      <w:r>
+        <w:t>These results were reported by Asraful while testing the integrated main branch at https://localhost:7016. CSV preview and success screenshots were also inspected during the review. This record does not claim independent execution by the reviewer.</w:t>
+      </w:r>
+    </w:p>
+    <w:tbl>
+      <w:tblPr>
+        <w:tblW w:type="auto" w:w="0"/>
+        <w:tblLayout w:type="fixed"/>
+        <w:tblLook w:firstColumn="1" w:firstRow="1" w:lastColumn="0" w:lastRow="0" w:noHBand="0" w:noVBand="1" w:val="04A0"/>
+      </w:tblPr>
+      <w:tblGrid>
+        <w:gridCol w:w="3408"/>
+        <w:gridCol w:w="3408"/>
+        <w:gridCol w:w="3408"/>
+      </w:tblGrid>
+      <w:tr>
+        <w:trPr>
+          <w:cantSplit/>
+          <w:tblHeader/>
+        </w:trPr>
+        <w:tc>
+          <w:tcPr>
+            <w:tcW w:type="dxa" w:w="1800"/>
+            <w:tcBorders>
+              <w:top w:val="single" w:sz="4" w:color="D9D9D9"/>
+              <w:left w:val="single" w:sz="4" w:color="D9D9D9"/>
+              <w:bottom w:val="single" w:sz="4" w:color="D9D9D9"/>
+              <w:right w:val="single" w:sz="4" w:color="D9D9D9"/>
+            </w:tcBorders>
+            <w:shd w:fill="EEEEEE"/>
+          </w:tcPr>
+          <w:p>
+            <w:pPr>
+              <w:spacing w:after="100" w:before="100"/>
+            </w:pPr>
+            <w:r>
+              <w:rPr>
+                <w:b/>
+                <w:color w:val="000000"/>
+                <w:sz w:val="18"/>
+              </w:rPr>
+              <w:t>Check</w:t>
+            </w:r>
+          </w:p>
+        </w:tc>
+        <w:tc>
+          <w:tcPr>
+            <w:tcW w:type="dxa" w:w="5256"/>
+            <w:tcBorders>
+              <w:top w:val="single" w:sz="4" w:color="D9D9D9"/>
+              <w:left w:val="single" w:sz="4" w:color="D9D9D9"/>
+              <w:bottom w:val="single" w:sz="4" w:color="D9D9D9"/>
+              <w:right w:val="single" w:sz="4" w:color="D9D9D9"/>
+            </w:tcBorders>
+            <w:shd w:fill="EEEEEE"/>
+          </w:tcPr>
+          <w:p>
+            <w:pPr>
+              <w:spacing w:after="100" w:before="100"/>
+            </w:pPr>
+            <w:r>
+              <w:rPr>
+                <w:b/>
+                <w:color w:val="000000"/>
+                <w:sz w:val="18"/>
+              </w:rPr>
+              <w:t>Observed outcome</w:t>
+            </w:r>
+          </w:p>
+        </w:tc>
+        <w:tc>
+          <w:tcPr>
+            <w:tcW w:type="dxa" w:w="1584"/>
+            <w:tcBorders>
+              <w:top w:val="single" w:sz="4" w:color="D9D9D9"/>
+              <w:left w:val="single" w:sz="4" w:color="D9D9D9"/>
+              <w:bottom w:val="single" w:sz="4" w:color="D9D9D9"/>
+              <w:right w:val="single" w:sz="4" w:color="D9D9D9"/>
+            </w:tcBorders>
+            <w:shd w:fill="EEEEEE"/>
+          </w:tcPr>
+          <w:p>
+            <w:pPr>
+              <w:spacing w:after="100" w:before="100"/>
+            </w:pPr>
+            <w:r>
+              <w:rPr>
+                <w:b/>
+                <w:color w:val="000000"/>
+                <w:sz w:val="18"/>
+              </w:rPr>
+              <w:t>Result</w:t>
+            </w:r>
+          </w:p>
+        </w:tc>
+      </w:tr>
+      <w:tr>
+        <w:trPr>
+          <w:cantSplit/>
+        </w:trPr>
+        <w:tc>
+          <w:tcPr>
+            <w:tcW w:type="dxa" w:w="1800"/>
+            <w:tcBorders>
+              <w:top w:val="single" w:sz="4" w:color="D9D9D9"/>
+              <w:left w:val="single" w:sz="4" w:color="D9D9D9"/>
+              <w:bottom w:val="single" w:sz="4" w:color="D9D9D9"/>
+              <w:right w:val="single" w:sz="4" w:color="D9D9D9"/>
+            </w:tcBorders>
+          </w:tcPr>
+          <w:p>
+            <w:pPr>
+              <w:spacing w:after="100" w:before="100"/>
+            </w:pPr>
+            <w:r>
+              <w:rPr>
+                <w:b w:val="0"/>
+                <w:color w:val="000000"/>
+                <w:sz w:val="18"/>
+              </w:rPr>
+              <w:t>Build and account lookup</w:t>
+            </w:r>
+          </w:p>
+        </w:tc>
+        <w:tc>
+          <w:tcPr>
+            <w:tcW w:type="dxa" w:w="5256"/>
+            <w:tcBorders>
+              <w:top w:val="single" w:sz="4" w:color="D9D9D9"/>
+              <w:left w:val="single" w:sz="4" w:color="D9D9D9"/>
+              <w:bottom w:val="single" w:sz="4" w:color="D9D9D9"/>
+              <w:right w:val="single" w:sz="4" w:color="D9D9D9"/>
+            </w:tcBorders>
+          </w:tcPr>
+          <w:p>
+            <w:pPr>
+              <w:spacing w:after="100" w:before="100"/>
+            </w:pPr>
+            <w:r>
+              <w:rPr>
+                <w:b w:val="0"/>
+                <w:color w:val="000000"/>
+                <w:sz w:val="18"/>
+              </w:rPr>
+              <w:t>Build succeeded; BR-DEMO3 opened the account and current loans.</w:t>
+            </w:r>
+          </w:p>
+        </w:tc>
+        <w:tc>
+          <w:tcPr>
+            <w:tcW w:type="dxa" w:w="1584"/>
+            <w:tcBorders>
+              <w:top w:val="single" w:sz="4" w:color="D9D9D9"/>
+              <w:left w:val="single" w:sz="4" w:color="D9D9D9"/>
+              <w:bottom w:val="single" w:sz="4" w:color="D9D9D9"/>
+              <w:right w:val="single" w:sz="4" w:color="D9D9D9"/>
+            </w:tcBorders>
+          </w:tcPr>
+          <w:p>
+            <w:pPr>
+              <w:spacing w:after="100" w:before="100"/>
+            </w:pPr>
+            <w:r>
+              <w:rPr>
+                <w:b w:val="0"/>
+                <w:color w:val="000000"/>
+                <w:sz w:val="18"/>
+              </w:rPr>
+              <w:t>Reported pass</w:t>
+            </w:r>
+          </w:p>
+        </w:tc>
+      </w:tr>
+      <w:tr>
+        <w:trPr>
+          <w:cantSplit/>
+        </w:trPr>
+        <w:tc>
+          <w:tcPr>
+            <w:tcW w:type="dxa" w:w="1800"/>
+            <w:tcBorders>
+              <w:top w:val="single" w:sz="4" w:color="D9D9D9"/>
+              <w:left w:val="single" w:sz="4" w:color="D9D9D9"/>
+              <w:bottom w:val="single" w:sz="4" w:color="D9D9D9"/>
+              <w:right w:val="single" w:sz="4" w:color="D9D9D9"/>
+            </w:tcBorders>
+          </w:tcPr>
+          <w:p>
+            <w:pPr>
+              <w:spacing w:after="100" w:before="100"/>
+            </w:pPr>
+            <w:r>
+              <w:rPr>
+                <w:b w:val="0"/>
+                <w:color w:val="000000"/>
+                <w:sz w:val="18"/>
+              </w:rPr>
+              <w:t>Sign out protection</w:t>
+            </w:r>
+          </w:p>
+        </w:tc>
+        <w:tc>
+          <w:tcPr>
+            <w:tcW w:type="dxa" w:w="5256"/>
+            <w:tcBorders>
+              <w:top w:val="single" w:sz="4" w:color="D9D9D9"/>
+              <w:left w:val="single" w:sz="4" w:color="D9D9D9"/>
+              <w:bottom w:val="single" w:sz="4" w:color="D9D9D9"/>
+              <w:right w:val="single" w:sz="4" w:color="D9D9D9"/>
+            </w:tcBorders>
+          </w:tcPr>
+          <w:p>
+            <w:pPr>
+              <w:spacing w:after="100" w:before="100"/>
+            </w:pPr>
+            <w:r>
+              <w:rPr>
+                <w:b w:val="0"/>
+                <w:color w:val="000000"/>
+                <w:sz w:val="18"/>
+              </w:rPr>
+              <w:t>After Finish session, /Kiosk/Account requested another card scan.</w:t>
+            </w:r>
+          </w:p>
+        </w:tc>
+        <w:tc>
+          <w:tcPr>
+            <w:tcW w:type="dxa" w:w="1584"/>
+            <w:tcBorders>
+              <w:top w:val="single" w:sz="4" w:color="D9D9D9"/>
+              <w:left w:val="single" w:sz="4" w:color="D9D9D9"/>
+              <w:bottom w:val="single" w:sz="4" w:color="D9D9D9"/>
+              <w:right w:val="single" w:sz="4" w:color="D9D9D9"/>
+            </w:tcBorders>
+          </w:tcPr>
+          <w:p>
+            <w:pPr>
+              <w:spacing w:after="100" w:before="100"/>
+            </w:pPr>
+            <w:r>
+              <w:rPr>
+                <w:b w:val="0"/>
+                <w:color w:val="000000"/>
+                <w:sz w:val="18"/>
+              </w:rPr>
+              <w:t>Reported pass</w:t>
+            </w:r>
+          </w:p>
+        </w:tc>
+      </w:tr>
+      <w:tr>
+        <w:trPr>
+          <w:cantSplit/>
+        </w:trPr>
+        <w:tc>
+          <w:tcPr>
+            <w:tcW w:type="dxa" w:w="1800"/>
+            <w:tcBorders>
+              <w:top w:val="single" w:sz="4" w:color="D9D9D9"/>
+              <w:left w:val="single" w:sz="4" w:color="D9D9D9"/>
+              <w:bottom w:val="single" w:sz="4" w:color="D9D9D9"/>
+              <w:right w:val="single" w:sz="4" w:color="D9D9D9"/>
+            </w:tcBorders>
+          </w:tcPr>
+          <w:p>
+            <w:pPr>
+              <w:spacing w:after="100" w:before="100"/>
+            </w:pPr>
+            <w:r>
+              <w:rPr>
+                <w:b w:val="0"/>
+                <w:color w:val="000000"/>
+                <w:sz w:val="18"/>
+              </w:rPr>
+              <w:t>Invalid borrower code</w:t>
+            </w:r>
+          </w:p>
+        </w:tc>
+        <w:tc>
+          <w:tcPr>
+            <w:tcW w:type="dxa" w:w="5256"/>
+            <w:tcBorders>
+              <w:top w:val="single" w:sz="4" w:color="D9D9D9"/>
+              <w:left w:val="single" w:sz="4" w:color="D9D9D9"/>
+              <w:bottom w:val="single" w:sz="4" w:color="D9D9D9"/>
+              <w:right w:val="single" w:sz="4" w:color="D9D9D9"/>
+            </w:tcBorders>
+          </w:tcPr>
+          <w:p>
+            <w:pPr>
+              <w:spacing w:after="100" w:before="100"/>
+            </w:pPr>
+            <w:r>
+              <w:rPr>
+                <w:b w:val="0"/>
+                <w:color w:val="000000"/>
+                <w:sz w:val="18"/>
+              </w:rPr>
+              <w:t>INVALID-123 was rejected on the welcome page.</w:t>
+            </w:r>
+          </w:p>
+        </w:tc>
+        <w:tc>
+          <w:tcPr>
+            <w:tcW w:type="dxa" w:w="1584"/>
+            <w:tcBorders>
+              <w:top w:val="single" w:sz="4" w:color="D9D9D9"/>
+              <w:left w:val="single" w:sz="4" w:color="D9D9D9"/>
+              <w:bottom w:val="single" w:sz="4" w:color="D9D9D9"/>
+              <w:right w:val="single" w:sz="4" w:color="D9D9D9"/>
+            </w:tcBorders>
+          </w:tcPr>
+          <w:p>
+            <w:pPr>
+              <w:spacing w:after="100" w:before="100"/>
+            </w:pPr>
+            <w:r>
+              <w:rPr>
+                <w:b w:val="0"/>
+                <w:color w:val="000000"/>
+                <w:sz w:val="18"/>
+              </w:rPr>
+              <w:t>Reported pass</w:t>
+            </w:r>
+          </w:p>
+        </w:tc>
+      </w:tr>
+      <w:tr>
+        <w:trPr>
+          <w:cantSplit/>
+        </w:trPr>
+        <w:tc>
+          <w:tcPr>
+            <w:tcW w:type="dxa" w:w="1800"/>
+            <w:tcBorders>
+              <w:top w:val="single" w:sz="4" w:color="D9D9D9"/>
+              <w:left w:val="single" w:sz="4" w:color="D9D9D9"/>
+              <w:bottom w:val="single" w:sz="4" w:color="D9D9D9"/>
+              <w:right w:val="single" w:sz="4" w:color="D9D9D9"/>
+            </w:tcBorders>
+          </w:tcPr>
+          <w:p>
+            <w:pPr>
+              <w:spacing w:after="100" w:before="100"/>
+            </w:pPr>
+            <w:r>
+              <w:rPr>
+                <w:b w:val="0"/>
+                <w:color w:val="000000"/>
+                <w:sz w:val="18"/>
+              </w:rPr>
+              <w:t>Invalid item code</w:t>
+            </w:r>
+          </w:p>
+        </w:tc>
+        <w:tc>
+          <w:tcPr>
+            <w:tcW w:type="dxa" w:w="5256"/>
+            <w:tcBorders>
+              <w:top w:val="single" w:sz="4" w:color="D9D9D9"/>
+              <w:left w:val="single" w:sz="4" w:color="D9D9D9"/>
+              <w:bottom w:val="single" w:sz="4" w:color="D9D9D9"/>
+              <w:right w:val="single" w:sz="4" w:color="D9D9D9"/>
+            </w:tcBorders>
+          </w:tcPr>
+          <w:p>
+            <w:pPr>
+              <w:spacing w:after="100" w:before="100"/>
+            </w:pPr>
+            <w:r>
+              <w:rPr>
+                <w:b w:val="0"/>
+                <w:color w:val="000000"/>
+                <w:sz w:val="18"/>
+              </w:rPr>
+              <w:t>INVALID-ITEM displayed the item-not-found error.</w:t>
+            </w:r>
+          </w:p>
+        </w:tc>
+        <w:tc>
+          <w:tcPr>
+            <w:tcW w:type="dxa" w:w="1584"/>
+            <w:tcBorders>
+              <w:top w:val="single" w:sz="4" w:color="D9D9D9"/>
+              <w:left w:val="single" w:sz="4" w:color="D9D9D9"/>
+              <w:bottom w:val="single" w:sz="4" w:color="D9D9D9"/>
+              <w:right w:val="single" w:sz="4" w:color="D9D9D9"/>
+            </w:tcBorders>
+          </w:tcPr>
+          <w:p>
+            <w:pPr>
+              <w:spacing w:after="100" w:before="100"/>
+            </w:pPr>
+            <w:r>
+              <w:rPr>
+                <w:b w:val="0"/>
+                <w:color w:val="000000"/>
+                <w:sz w:val="18"/>
+              </w:rPr>
+              <w:t>Reported pass</w:t>
+            </w:r>
+          </w:p>
+        </w:tc>
+      </w:tr>
+      <w:tr>
+        <w:trPr>
+          <w:cantSplit/>
+        </w:trPr>
+        <w:tc>
+          <w:tcPr>
+            <w:tcW w:type="dxa" w:w="1800"/>
+            <w:tcBorders>
+              <w:top w:val="single" w:sz="4" w:color="D9D9D9"/>
+              <w:left w:val="single" w:sz="4" w:color="D9D9D9"/>
+              <w:bottom w:val="single" w:sz="4" w:color="D9D9D9"/>
+              <w:right w:val="single" w:sz="4" w:color="D9D9D9"/>
+            </w:tcBorders>
+          </w:tcPr>
+          <w:p>
+            <w:pPr>
+              <w:spacing w:after="100" w:before="100"/>
+            </w:pPr>
+            <w:r>
+              <w:rPr>
+                <w:b w:val="0"/>
+                <w:color w:val="000000"/>
+                <w:sz w:val="18"/>
+              </w:rPr>
+              <w:t>Borrowing and duplicates</w:t>
+            </w:r>
+          </w:p>
+        </w:tc>
+        <w:tc>
+          <w:tcPr>
+            <w:tcW w:type="dxa" w:w="5256"/>
+            <w:tcBorders>
+              <w:top w:val="single" w:sz="4" w:color="D9D9D9"/>
+              <w:left w:val="single" w:sz="4" w:color="D9D9D9"/>
+              <w:bottom w:val="single" w:sz="4" w:color="D9D9D9"/>
+              <w:right w:val="single" w:sz="4" w:color="D9D9D9"/>
+            </w:tcBorders>
+          </w:tcPr>
+          <w:p>
+            <w:pPr>
+              <w:spacing w:after="100" w:before="100"/>
+            </w:pPr>
+            <w:r>
+              <w:rPr>
+                <w:b w:val="0"/>
+                <w:color w:val="000000"/>
+                <w:sz w:val="18"/>
+              </w:rPr>
+              <w:t>An available item was borrowed; repeating the code was rejected without a second loan.</w:t>
+            </w:r>
+          </w:p>
+        </w:tc>
+        <w:tc>
+          <w:tcPr>
+            <w:tcW w:type="dxa" w:w="1584"/>
+            <w:tcBorders>
+              <w:top w:val="single" w:sz="4" w:color="D9D9D9"/>
+              <w:left w:val="single" w:sz="4" w:color="D9D9D9"/>
+              <w:bottom w:val="single" w:sz="4" w:color="D9D9D9"/>
+              <w:right w:val="single" w:sz="4" w:color="D9D9D9"/>
+            </w:tcBorders>
+          </w:tcPr>
+          <w:p>
+            <w:pPr>
+              <w:spacing w:after="100" w:before="100"/>
+            </w:pPr>
+            <w:r>
+              <w:rPr>
+                <w:b w:val="0"/>
+                <w:color w:val="000000"/>
+                <w:sz w:val="18"/>
+              </w:rPr>
+              <w:t>Reported pass</w:t>
+            </w:r>
+          </w:p>
+        </w:tc>
+      </w:tr>
+      <w:tr>
+        <w:trPr>
+          <w:cantSplit/>
+        </w:trPr>
+        <w:tc>
+          <w:tcPr>
+            <w:tcW w:type="dxa" w:w="1800"/>
+            <w:tcBorders>
+              <w:top w:val="single" w:sz="4" w:color="D9D9D9"/>
+              <w:left w:val="single" w:sz="4" w:color="D9D9D9"/>
+              <w:bottom w:val="single" w:sz="4" w:color="D9D9D9"/>
+              <w:right w:val="single" w:sz="4" w:color="D9D9D9"/>
+            </w:tcBorders>
+          </w:tcPr>
+          <w:p>
+            <w:pPr>
+              <w:spacing w:after="100" w:before="100"/>
+            </w:pPr>
+            <w:r>
+              <w:rPr>
+                <w:b w:val="0"/>
+                <w:color w:val="000000"/>
+                <w:sz w:val="18"/>
+              </w:rPr>
+              <w:t>Reception return</w:t>
+            </w:r>
+          </w:p>
+        </w:tc>
+        <w:tc>
+          <w:tcPr>
+            <w:tcW w:type="dxa" w:w="5256"/>
+            <w:tcBorders>
+              <w:top w:val="single" w:sz="4" w:color="D9D9D9"/>
+              <w:left w:val="single" w:sz="4" w:color="D9D9D9"/>
+              <w:bottom w:val="single" w:sz="4" w:color="D9D9D9"/>
+              <w:right w:val="single" w:sz="4" w:color="D9D9D9"/>
+            </w:tcBorders>
+          </w:tcPr>
+          <w:p>
+            <w:pPr>
+              <w:spacing w:after="100" w:before="100"/>
+            </w:pPr>
+            <w:r>
+              <w:rPr>
+                <w:b w:val="0"/>
+                <w:color w:val="000000"/>
+                <w:sz w:val="18"/>
+              </w:rPr>
+              <w:t>Return completed and item availability was checked.</w:t>
+            </w:r>
+          </w:p>
+        </w:tc>
+        <w:tc>
+          <w:tcPr>
+            <w:tcW w:type="dxa" w:w="1584"/>
+            <w:tcBorders>
+              <w:top w:val="single" w:sz="4" w:color="D9D9D9"/>
+              <w:left w:val="single" w:sz="4" w:color="D9D9D9"/>
+              <w:bottom w:val="single" w:sz="4" w:color="D9D9D9"/>
+              <w:right w:val="single" w:sz="4" w:color="D9D9D9"/>
+            </w:tcBorders>
+          </w:tcPr>
+          <w:p>
+            <w:pPr>
+              <w:spacing w:after="100" w:before="100"/>
+            </w:pPr>
+            <w:r>
+              <w:rPr>
+                <w:b w:val="0"/>
+                <w:color w:val="000000"/>
+                <w:sz w:val="18"/>
+              </w:rPr>
+              <w:t>Reported pass</w:t>
+            </w:r>
+          </w:p>
+        </w:tc>
+      </w:tr>
+      <w:tr>
+        <w:trPr>
+          <w:cantSplit/>
+        </w:trPr>
+        <w:tc>
+          <w:tcPr>
+            <w:tcW w:type="dxa" w:w="1800"/>
+            <w:tcBorders>
+              <w:top w:val="single" w:sz="4" w:color="D9D9D9"/>
+              <w:left w:val="single" w:sz="4" w:color="D9D9D9"/>
+              <w:bottom w:val="single" w:sz="4" w:color="D9D9D9"/>
+              <w:right w:val="single" w:sz="4" w:color="D9D9D9"/>
+            </w:tcBorders>
+          </w:tcPr>
+          <w:p>
+            <w:pPr>
+              <w:spacing w:after="100" w:before="100"/>
+            </w:pPr>
+            <w:r>
+              <w:rPr>
+                <w:b w:val="0"/>
+                <w:color w:val="000000"/>
+                <w:sz w:val="18"/>
+              </w:rPr>
+              <w:t>Keyboard and display</w:t>
+            </w:r>
+          </w:p>
+        </w:tc>
+        <w:tc>
+          <w:tcPr>
+            <w:tcW w:type="dxa" w:w="5256"/>
+            <w:tcBorders>
+              <w:top w:val="single" w:sz="4" w:color="D9D9D9"/>
+              <w:left w:val="single" w:sz="4" w:color="D9D9D9"/>
+              <w:bottom w:val="single" w:sz="4" w:color="D9D9D9"/>
+              <w:right w:val="single" w:sz="4" w:color="D9D9D9"/>
+            </w:tcBorders>
+          </w:tcPr>
+          <w:p>
+            <w:pPr>
+              <w:spacing w:after="100" w:before="100"/>
+            </w:pPr>
+            <w:r>
+              <w:rPr>
+                <w:b w:val="0"/>
+                <w:color w:val="000000"/>
+                <w:sz w:val="18"/>
+              </w:rPr>
+              <w:t>Tab and Enter, high contrast and larger text worked on welcome, account and borrowing pages.</w:t>
+            </w:r>
+          </w:p>
+        </w:tc>
+        <w:tc>
+          <w:tcPr>
+            <w:tcW w:type="dxa" w:w="1584"/>
+            <w:tcBorders>
+              <w:top w:val="single" w:sz="4" w:color="D9D9D9"/>
+              <w:left w:val="single" w:sz="4" w:color="D9D9D9"/>
+              <w:bottom w:val="single" w:sz="4" w:color="D9D9D9"/>
+              <w:right w:val="single" w:sz="4" w:color="D9D9D9"/>
+            </w:tcBorders>
+          </w:tcPr>
+          <w:p>
+            <w:pPr>
+              <w:spacing w:after="100" w:before="100"/>
+            </w:pPr>
+            <w:r>
+              <w:rPr>
+                <w:b w:val="0"/>
+                <w:color w:val="000000"/>
+                <w:sz w:val="18"/>
+              </w:rPr>
+              <w:t>Reported pass</w:t>
+            </w:r>
+          </w:p>
+        </w:tc>
+      </w:tr>
+      <w:tr>
+        <w:trPr>
+          <w:cantSplit/>
+        </w:trPr>
+        <w:tc>
+          <w:tcPr>
+            <w:tcW w:type="dxa" w:w="1800"/>
+            <w:tcBorders>
+              <w:top w:val="single" w:sz="4" w:color="D9D9D9"/>
+              <w:left w:val="single" w:sz="4" w:color="D9D9D9"/>
+              <w:bottom w:val="single" w:sz="4" w:color="D9D9D9"/>
+              <w:right w:val="single" w:sz="4" w:color="D9D9D9"/>
+            </w:tcBorders>
+          </w:tcPr>
+          <w:p>
+            <w:pPr>
+              <w:spacing w:after="100" w:before="100"/>
+            </w:pPr>
+            <w:r>
+              <w:rPr>
+                <w:b w:val="0"/>
+                <w:color w:val="000000"/>
+                <w:sz w:val="18"/>
+              </w:rPr>
+              <w:t>Session expiry</w:t>
+            </w:r>
+          </w:p>
+        </w:tc>
+        <w:tc>
+          <w:tcPr>
+            <w:tcW w:type="dxa" w:w="5256"/>
+            <w:tcBorders>
+              <w:top w:val="single" w:sz="4" w:color="D9D9D9"/>
+              <w:left w:val="single" w:sz="4" w:color="D9D9D9"/>
+              <w:bottom w:val="single" w:sz="4" w:color="D9D9D9"/>
+              <w:right w:val="single" w:sz="4" w:color="D9D9D9"/>
+            </w:tcBorders>
+          </w:tcPr>
+          <w:p>
+            <w:pPr>
+              <w:spacing w:after="100" w:before="100"/>
+            </w:pPr>
+            <w:r>
+              <w:rPr>
+                <w:b w:val="0"/>
+                <w:color w:val="000000"/>
+                <w:sz w:val="18"/>
+              </w:rPr>
+              <w:t>Leaving the account idle for over two minutes then refreshing required a new card scan.</w:t>
+            </w:r>
+          </w:p>
+        </w:tc>
+        <w:tc>
+          <w:tcPr>
+            <w:tcW w:type="dxa" w:w="1584"/>
+            <w:tcBorders>
+              <w:top w:val="single" w:sz="4" w:color="D9D9D9"/>
+              <w:left w:val="single" w:sz="4" w:color="D9D9D9"/>
+              <w:bottom w:val="single" w:sz="4" w:color="D9D9D9"/>
+              <w:right w:val="single" w:sz="4" w:color="D9D9D9"/>
+            </w:tcBorders>
+          </w:tcPr>
+          <w:p>
+            <w:pPr>
+              <w:spacing w:after="100" w:before="100"/>
+            </w:pPr>
+            <w:r>
+              <w:rPr>
+                <w:b w:val="0"/>
+                <w:color w:val="000000"/>
+                <w:sz w:val="18"/>
+              </w:rPr>
+              <w:t>Reported pass</w:t>
+            </w:r>
+          </w:p>
+        </w:tc>
+      </w:tr>
+      <w:tr>
+        <w:trPr>
+          <w:cantSplit/>
+        </w:trPr>
+        <w:tc>
+          <w:tcPr>
+            <w:tcW w:type="dxa" w:w="1800"/>
+            <w:tcBorders>
+              <w:top w:val="single" w:sz="4" w:color="D9D9D9"/>
+              <w:left w:val="single" w:sz="4" w:color="D9D9D9"/>
+              <w:bottom w:val="single" w:sz="4" w:color="D9D9D9"/>
+              <w:right w:val="single" w:sz="4" w:color="D9D9D9"/>
+            </w:tcBorders>
+          </w:tcPr>
+          <w:p>
+            <w:pPr>
+              <w:spacing w:after="100" w:before="100"/>
+            </w:pPr>
+            <w:r>
+              <w:rPr>
+                <w:b w:val="0"/>
+                <w:color w:val="000000"/>
+                <w:sz w:val="18"/>
+              </w:rPr>
+              <w:t>Valid CSV import</w:t>
+            </w:r>
+          </w:p>
+        </w:tc>
+        <w:tc>
+          <w:tcPr>
+            <w:tcW w:type="dxa" w:w="5256"/>
+            <w:tcBorders>
+              <w:top w:val="single" w:sz="4" w:color="D9D9D9"/>
+              <w:left w:val="single" w:sz="4" w:color="D9D9D9"/>
+              <w:bottom w:val="single" w:sz="4" w:color="D9D9D9"/>
+              <w:right w:val="single" w:sz="4" w:color="D9D9D9"/>
+            </w:tcBorders>
+          </w:tcPr>
+          <w:p>
+            <w:pPr>
+              <w:spacing w:after="100" w:before="100"/>
+            </w:pPr>
+            <w:r>
+              <w:rPr>
+                <w:b w:val="0"/>
+                <w:color w:val="000000"/>
+                <w:sz w:val="18"/>
+              </w:rPr>
+              <w:t>Preview showed 1 valid and 0 invalid rows; confirmation imported 1 item.</w:t>
+            </w:r>
+          </w:p>
+        </w:tc>
+        <w:tc>
+          <w:tcPr>
+            <w:tcW w:type="dxa" w:w="1584"/>
+            <w:tcBorders>
+              <w:top w:val="single" w:sz="4" w:color="D9D9D9"/>
+              <w:left w:val="single" w:sz="4" w:color="D9D9D9"/>
+              <w:bottom w:val="single" w:sz="4" w:color="D9D9D9"/>
+              <w:right w:val="single" w:sz="4" w:color="D9D9D9"/>
+            </w:tcBorders>
+          </w:tcPr>
+          <w:p>
+            <w:pPr>
+              <w:spacing w:after="100" w:before="100"/>
+            </w:pPr>
+            <w:r>
+              <w:rPr>
+                <w:b w:val="0"/>
+                <w:color w:val="000000"/>
+                <w:sz w:val="18"/>
+              </w:rPr>
+              <w:t>Screenshot verified</w:t>
+            </w:r>
+          </w:p>
+        </w:tc>
+      </w:tr>
+      <w:tr>
+        <w:trPr>
+          <w:cantSplit/>
+        </w:trPr>
+        <w:tc>
+          <w:tcPr>
+            <w:tcW w:type="dxa" w:w="1800"/>
+            <w:tcBorders>
+              <w:top w:val="single" w:sz="4" w:color="D9D9D9"/>
+              <w:left w:val="single" w:sz="4" w:color="D9D9D9"/>
+              <w:bottom w:val="single" w:sz="4" w:color="D9D9D9"/>
+              <w:right w:val="single" w:sz="4" w:color="D9D9D9"/>
+            </w:tcBorders>
+          </w:tcPr>
+          <w:p>
+            <w:pPr>
+              <w:spacing w:after="100" w:before="100"/>
+            </w:pPr>
+            <w:r>
+              <w:rPr>
+                <w:b w:val="0"/>
+                <w:color w:val="000000"/>
+                <w:sz w:val="18"/>
+              </w:rPr>
+              <w:t>Catalogue after import</w:t>
+            </w:r>
+          </w:p>
+        </w:tc>
+        <w:tc>
+          <w:tcPr>
+            <w:tcW w:type="dxa" w:w="5256"/>
+            <w:tcBorders>
+              <w:top w:val="single" w:sz="4" w:color="D9D9D9"/>
+              <w:left w:val="single" w:sz="4" w:color="D9D9D9"/>
+              <w:bottom w:val="single" w:sz="4" w:color="D9D9D9"/>
+              <w:right w:val="single" w:sz="4" w:color="D9D9D9"/>
+            </w:tcBorders>
+          </w:tcPr>
+          <w:p>
+            <w:pPr>
+              <w:spacing w:after="100" w:before="100"/>
+            </w:pPr>
+            <w:r>
+              <w:rPr>
+                <w:b w:val="0"/>
+                <w:color w:val="000000"/>
+                <w:sz w:val="18"/>
+              </w:rPr>
+              <w:t>BK-ASR-VALID-01 appeared as Asraful Import Test with Available status.</w:t>
+            </w:r>
+          </w:p>
+        </w:tc>
+        <w:tc>
+          <w:tcPr>
+            <w:tcW w:type="dxa" w:w="1584"/>
+            <w:tcBorders>
+              <w:top w:val="single" w:sz="4" w:color="D9D9D9"/>
+              <w:left w:val="single" w:sz="4" w:color="D9D9D9"/>
+              <w:bottom w:val="single" w:sz="4" w:color="D9D9D9"/>
+              <w:right w:val="single" w:sz="4" w:color="D9D9D9"/>
+            </w:tcBorders>
+          </w:tcPr>
+          <w:p>
+            <w:pPr>
+              <w:spacing w:after="100" w:before="100"/>
+            </w:pPr>
+            <w:r>
+              <w:rPr>
+                <w:b w:val="0"/>
+                <w:color w:val="000000"/>
+                <w:sz w:val="18"/>
+              </w:rPr>
+              <w:t>Reported pass</w:t>
+            </w:r>
+          </w:p>
+        </w:tc>
+      </w:tr>
+    </w:tbl>
+    <w:p>
+      <w:r>
+        <w:br w:type="page"/>
+      </w:r>
+    </w:p>
+    <w:p>
+      <w:pPr>
+        <w:pStyle w:val="Title"/>
+      </w:pPr>
+      <w:r>
+        <w:t>Evidence and contribution record</w:t>
+      </w:r>
+    </w:p>
+    <w:p>
+      <w:pPr>
+        <w:pStyle w:val="Heading1"/>
+      </w:pPr>
+      <w:r>
+        <w:t>CSV peer review</w:t>
+      </w:r>
+    </w:p>
+    <w:p>
+      <w:r>
+        <w:t>The duplicate-code CSV was rejected with the message that nothing had been imported. The row-level duplicate messages were not independently inspected, so this record confirms rejection only. The valid CSV import was confirmed by preview and success screenshots, followed by the tester’s confirmation of the catalogue result.</w:t>
+      </w:r>
+    </w:p>
+    <w:p>
+      <w:pPr>
+        <w:pStyle w:val="Heading1"/>
+      </w:pPr>
+      <w:r>
+        <w:t>Evidence saved in the repository</w:t>
+      </w:r>
+    </w:p>
+    <w:p>
+      <w:r>
+        <w:t>Folder: Docs/Asraful/Evidence/</w:t>
+      </w:r>
+    </w:p>
+    <w:p>
+      <w:pPr>
+        <w:pStyle w:val="ListBullet"/>
+      </w:pPr>
+      <w:r>
+        <w:t>Borrow-Success.png</w:t>
+      </w:r>
+    </w:p>
+    <w:p>
+      <w:pPr>
+        <w:pStyle w:val="ListBullet"/>
+      </w:pPr>
+      <w:r>
+        <w:t>Loan-Returned.png</w:t>
+      </w:r>
+    </w:p>
+    <w:p>
+      <w:pPr>
+        <w:pStyle w:val="ListBullet"/>
+      </w:pPr>
+      <w:r>
+        <w:t>Kiosk-High-Contrast.png</w:t>
+      </w:r>
+    </w:p>
+    <w:p>
+      <w:pPr>
+        <w:pStyle w:val="ListBullet"/>
+      </w:pPr>
+      <w:r>
+        <w:t>CSV-Duplicate-Rejected.png</w:t>
+      </w:r>
+    </w:p>
+    <w:p>
+      <w:pPr>
+        <w:pStyle w:val="ListBullet"/>
+      </w:pPr>
+      <w:r>
+        <w:t>CSV-Valid-Preview.png</w:t>
+      </w:r>
+    </w:p>
+    <w:p>
+      <w:pPr>
+        <w:pStyle w:val="ListBullet"/>
+      </w:pPr>
+      <w:r>
+        <w:t>CSV-Import-Success.png</w:t>
+      </w:r>
+    </w:p>
+    <w:p>
+      <w:pPr>
+        <w:pStyle w:val="ListBullet"/>
+      </w:pPr>
+      <w:r>
+        <w:t>CSV-Imported-Book-Catalogue.png</w:t>
+      </w:r>
+    </w:p>
+    <w:p>
+      <w:pPr>
+        <w:pStyle w:val="ListBullet"/>
+      </w:pPr>
+      <w:r>
+        <w:t>valid-import-test.csv</w:t>
+      </w:r>
+    </w:p>
+    <w:p>
+      <w:r>
+        <w:t>Git output confirmed evidence commit 11fabb5 was pushed to main. This identifies the evidence upload; it does not establish the exact source commit used for every test.</w:t>
+      </w:r>
+    </w:p>
+    <w:p>
+      <w:pPr>
+        <w:pStyle w:val="Heading1"/>
+      </w:pPr>
+      <w:r>
+        <w:t>Scope of verification</w:t>
+      </w:r>
+    </w:p>
+    <w:p>
+      <w:r>
+        <w:t>Borrower and item codes were tested through manual entry. Physical barcode scanner testing was not performed because hardware was unavailable. Screen reader testing, full accessibility compliance, reservation and notification integration, and a fresh CDU VM installation are not established by these checks.</w:t>
+      </w:r>
+    </w:p>
+    <w:p>
+      <w:pPr>
+        <w:pStyle w:val="Heading1"/>
+      </w:pPr>
+      <w:r>
+        <w:t>Estimated actual hours</w:t>
+      </w:r>
+    </w:p>
+    <w:p>
+      <w:r>
+        <w:t>Asraful supplied a retrospective total estimate of 22 hours. The allocation below is an approximate breakdown for the contribution record, rather than a contemporaneous timesheet.</w:t>
+      </w:r>
+    </w:p>
+    <w:p>
+      <w:r>
+        <w:t>Kiosk development: 9 hours</w:t>
+      </w:r>
+    </w:p>
+    <w:p>
+      <w:r>
+        <w:t>Website styling and accessibility: 6 hours</w:t>
+      </w:r>
+    </w:p>
+    <w:p>
+      <w:r>
+        <w:t>Testing and fixes: 4 hours</w:t>
+      </w:r>
+    </w:p>
+    <w:p>
+      <w:r>
+        <w:t>Documentation: 3 hours</w:t>
+      </w:r>
+    </w:p>
+    <w:p>
+      <w:r>
+        <w:t>Total: 22 hours</w:t>
       </w:r>
     </w:p>
     <w:sectPr>

</xml_diff>